<commit_message>
Fix to listing of nbr_cell_IDs
Neighbour cell IDs was outputting the index of the neighbours not the ID from the original data, this has been fixed.

Issue when creating the venv using Python 3.12 so updated the tutorial to recommend the use of Python 3.11.
</commit_message>
<xml_diff>
--- a/Tutorials/IVEN2 Python Instructions.docx
+++ b/Tutorials/IVEN2 Python Instructions.docx
@@ -1,6 +1,6 @@
 
 <file path=word/document.xml><?xml version="1.0" encoding="utf-8"?>
-<w:document xmlns:wpc="http://schemas.microsoft.com/office/word/2010/wordprocessingCanvas" xmlns:cx="http://schemas.microsoft.com/office/drawing/2014/chartex" xmlns:cx1="http://schemas.microsoft.com/office/drawing/2015/9/8/chartex" xmlns:cx2="http://schemas.microsoft.com/office/drawing/2015/10/21/chartex" xmlns:cx3="http://schemas.microsoft.com/office/drawing/2016/5/9/chartex" xmlns:cx4="http://schemas.microsoft.com/office/drawing/2016/5/10/chartex" xmlns:cx5="http://schemas.microsoft.com/office/drawing/2016/5/11/chartex" xmlns:cx6="http://schemas.microsoft.com/office/drawing/2016/5/12/chartex" xmlns:cx7="http://schemas.microsoft.com/office/drawing/2016/5/13/chartex" xmlns:cx8="http://schemas.microsoft.com/office/drawing/2016/5/14/chartex" xmlns:mc="http://schemas.openxmlformats.org/markup-compatibility/2006" xmlns:aink="http://schemas.microsoft.com/office/drawing/2016/ink" xmlns:am3d="http://schemas.microsoft.com/office/drawing/2017/model3d" xmlns:o="urn:schemas-microsoft-com:office:office" xmlns:oel="http://schemas.microsoft.com/office/2019/extlst" xmlns:r="http://schemas.openxmlformats.org/officeDocument/2006/relationships" xmlns:m="http://schemas.openxmlformats.org/officeDocument/2006/math" xmlns:v="urn:schemas-microsoft-com:vml" xmlns:wp14="http://schemas.microsoft.com/office/word/2010/wordprocessingDrawing" xmlns:wp="http://schemas.openxmlformats.org/drawingml/2006/wordprocessingDrawing" xmlns:w10="urn:schemas-microsoft-com:office:word" xmlns:w="http://schemas.openxmlformats.org/wordprocessingml/2006/main" xmlns:w14="http://schemas.microsoft.com/office/word/2010/wordml" xmlns:w15="http://schemas.microsoft.com/office/word/2012/wordml" xmlns:w16cex="http://schemas.microsoft.com/office/word/2018/wordml/cex" xmlns:w16cid="http://schemas.microsoft.com/office/word/2016/wordml/cid" xmlns:w16="http://schemas.microsoft.com/office/word/2018/wordml" xmlns:w16sdtdh="http://schemas.microsoft.com/office/word/2020/wordml/sdtdatahash" xmlns:w16se="http://schemas.microsoft.com/office/word/2015/wordml/symex" xmlns:wpg="http://schemas.microsoft.com/office/word/2010/wordprocessingGroup" xmlns:wpi="http://schemas.microsoft.com/office/word/2010/wordprocessingInk" xmlns:wne="http://schemas.microsoft.com/office/word/2006/wordml" xmlns:wps="http://schemas.microsoft.com/office/word/2010/wordprocessingShape" mc:Ignorable="w14 w15 w16se w16cid w16 w16cex w16sdtdh wp14">
+<w:document xmlns:wpc="http://schemas.microsoft.com/office/word/2010/wordprocessingCanvas" xmlns:cx="http://schemas.microsoft.com/office/drawing/2014/chartex" xmlns:cx1="http://schemas.microsoft.com/office/drawing/2015/9/8/chartex" xmlns:cx2="http://schemas.microsoft.com/office/drawing/2015/10/21/chartex" xmlns:cx3="http://schemas.microsoft.com/office/drawing/2016/5/9/chartex" xmlns:cx4="http://schemas.microsoft.com/office/drawing/2016/5/10/chartex" xmlns:cx5="http://schemas.microsoft.com/office/drawing/2016/5/11/chartex" xmlns:cx6="http://schemas.microsoft.com/office/drawing/2016/5/12/chartex" xmlns:cx7="http://schemas.microsoft.com/office/drawing/2016/5/13/chartex" xmlns:cx8="http://schemas.microsoft.com/office/drawing/2016/5/14/chartex" xmlns:mc="http://schemas.openxmlformats.org/markup-compatibility/2006" xmlns:aink="http://schemas.microsoft.com/office/drawing/2016/ink" xmlns:am3d="http://schemas.microsoft.com/office/drawing/2017/model3d" xmlns:o="urn:schemas-microsoft-com:office:office" xmlns:oel="http://schemas.microsoft.com/office/2019/extlst" xmlns:r="http://schemas.openxmlformats.org/officeDocument/2006/relationships" xmlns:m="http://schemas.openxmlformats.org/officeDocument/2006/math" xmlns:v="urn:schemas-microsoft-com:vml" xmlns:wp14="http://schemas.microsoft.com/office/word/2010/wordprocessingDrawing" xmlns:wp="http://schemas.openxmlformats.org/drawingml/2006/wordprocessingDrawing" xmlns:w10="urn:schemas-microsoft-com:office:word" xmlns:w="http://schemas.openxmlformats.org/wordprocessingml/2006/main" xmlns:w14="http://schemas.microsoft.com/office/word/2010/wordml" xmlns:w15="http://schemas.microsoft.com/office/word/2012/wordml" xmlns:w16cex="http://schemas.microsoft.com/office/word/2018/wordml/cex" xmlns:w16cid="http://schemas.microsoft.com/office/word/2016/wordml/cid" xmlns:w16="http://schemas.microsoft.com/office/word/2018/wordml" xmlns:w16du="http://schemas.microsoft.com/office/word/2023/wordml/word16du" xmlns:w16sdtdh="http://schemas.microsoft.com/office/word/2020/wordml/sdtdatahash" xmlns:w16se="http://schemas.microsoft.com/office/word/2015/wordml/symex" xmlns:wpg="http://schemas.microsoft.com/office/word/2010/wordprocessingGroup" xmlns:wpi="http://schemas.microsoft.com/office/word/2010/wordprocessingInk" xmlns:wne="http://schemas.microsoft.com/office/word/2006/wordml" xmlns:wps="http://schemas.microsoft.com/office/word/2010/wordprocessingShape" mc:Ignorable="w14 w15 w16se w16cid w16 w16cex w16sdtdh w16du wp14">
   <w:body>
     <w:p>
       <w:pPr>
@@ -54,14 +54,7 @@
           <w:rFonts w:ascii="Arial" w:hAnsi="Arial" w:cs="Arial"/>
           <w:b/>
         </w:rPr>
-        <w:t xml:space="preserve">] </w:t>
-      </w:r>
-      <w:r>
-        <w:rPr>
-          <w:rFonts w:ascii="Arial" w:hAnsi="Arial" w:cs="Arial"/>
-          <w:b/>
-        </w:rPr>
-        <w:t>and virtual environment)</w:t>
+        <w:t>] and virtual environment)</w:t>
       </w:r>
       <w:r>
         <w:rPr>
@@ -111,25 +104,7 @@
         <w:rPr>
           <w:rFonts w:ascii="Arial" w:hAnsi="Arial" w:cs="Arial"/>
         </w:rPr>
-        <w:t>This tutorial outlines how to use IVEN</w:t>
-      </w:r>
-      <w:r>
-        <w:rPr>
-          <w:rFonts w:ascii="Arial" w:hAnsi="Arial" w:cs="Arial"/>
-        </w:rPr>
-        <w:t>2.0</w:t>
-      </w:r>
-      <w:r>
-        <w:rPr>
-          <w:rFonts w:ascii="Arial" w:hAnsi="Arial" w:cs="Arial"/>
-        </w:rPr>
-        <w:t xml:space="preserve"> in the Python platform. </w:t>
-      </w:r>
-      <w:r>
-        <w:rPr>
-          <w:rFonts w:ascii="Arial" w:hAnsi="Arial" w:cs="Arial"/>
-        </w:rPr>
-        <w:t>Data assembly has been made more flexible. Data must now be imported in the following format</w:t>
+        <w:t>This tutorial outlines how to use IVEN2.0 in the Python platform. Data assembly has been made more flexible. Data must now be imported in the following format</w:t>
       </w:r>
       <w:r>
         <w:rPr>
@@ -415,28 +390,32 @@
           <w:b/>
           <w:bCs/>
         </w:rPr>
-        <w:t xml:space="preserve"> </w:t>
-      </w:r>
-      <w:r>
-        <w:rPr>
-          <w:rFonts w:ascii="Arial" w:hAnsi="Arial" w:cs="Arial"/>
-          <w:b/>
-          <w:bCs/>
-        </w:rPr>
-        <w:t>Python Install</w:t>
-      </w:r>
-    </w:p>
-    <w:p>
-      <w:pPr>
-        <w:rPr>
-          <w:rFonts w:ascii="Arial" w:hAnsi="Arial" w:cs="Arial"/>
-        </w:rPr>
-      </w:pPr>
-      <w:r>
-        <w:rPr>
-          <w:rFonts w:ascii="Arial" w:hAnsi="Arial" w:cs="Arial"/>
-        </w:rPr>
-        <w:t>Download the latest stable version of Python from (</w:t>
+        <w:t xml:space="preserve"> Python Install</w:t>
+      </w:r>
+    </w:p>
+    <w:p>
+      <w:pPr>
+        <w:rPr>
+          <w:rFonts w:ascii="Arial" w:hAnsi="Arial" w:cs="Arial"/>
+        </w:rPr>
+      </w:pPr>
+      <w:r>
+        <w:rPr>
+          <w:rFonts w:ascii="Arial" w:hAnsi="Arial" w:cs="Arial"/>
+        </w:rPr>
+        <w:t xml:space="preserve">Download the </w:t>
+      </w:r>
+      <w:r>
+        <w:rPr>
+          <w:rFonts w:ascii="Arial" w:hAnsi="Arial" w:cs="Arial"/>
+        </w:rPr>
+        <w:t>Python 3.11</w:t>
+      </w:r>
+      <w:r>
+        <w:rPr>
+          <w:rFonts w:ascii="Arial" w:hAnsi="Arial" w:cs="Arial"/>
+        </w:rPr>
+        <w:t xml:space="preserve"> from (</w:t>
       </w:r>
       <w:hyperlink r:id="rId5" w:history="1">
         <w:r>
@@ -447,19 +426,17 @@
           <w:t>https://www.python.org/downloads/</w:t>
         </w:r>
       </w:hyperlink>
-      <w:proofErr w:type="gramStart"/>
-      <w:r>
-        <w:rPr>
-          <w:rFonts w:ascii="Arial" w:hAnsi="Arial" w:cs="Arial"/>
-        </w:rPr>
-        <w:t>) .</w:t>
-      </w:r>
-      <w:proofErr w:type="gramEnd"/>
-      <w:r>
-        <w:rPr>
-          <w:rFonts w:ascii="Arial" w:hAnsi="Arial" w:cs="Arial"/>
-        </w:rPr>
-        <w:t xml:space="preserve"> </w:t>
+      <w:r>
+        <w:rPr>
+          <w:rFonts w:ascii="Arial" w:hAnsi="Arial" w:cs="Arial"/>
+        </w:rPr>
+        <w:t xml:space="preserve">) . </w:t>
+      </w:r>
+      <w:r>
+        <w:rPr>
+          <w:rFonts w:ascii="Arial" w:hAnsi="Arial" w:cs="Arial"/>
+        </w:rPr>
+        <w:t xml:space="preserve">Current update to 3.12 causes slight problems when creating the virtual environment with these instructions. </w:t>
       </w:r>
     </w:p>
     <w:p>
@@ -762,7 +739,6 @@
           <w:rFonts w:ascii="Arial" w:hAnsi="Arial" w:cs="Arial"/>
         </w:rPr>
       </w:pPr>
-      <w:proofErr w:type="gramStart"/>
       <w:r>
         <w:rPr>
           <w:rFonts w:ascii="Arial" w:hAnsi="Arial" w:cs="Arial"/>
@@ -773,14 +749,7 @@
         <w:rPr>
           <w:rFonts w:ascii="Courier New" w:hAnsi="Courier New" w:cs="Courier New"/>
         </w:rPr>
-        <w:t>.</w:t>
-      </w:r>
-      <w:proofErr w:type="gramEnd"/>
-      <w:r>
-        <w:rPr>
-          <w:rFonts w:ascii="Courier New" w:hAnsi="Courier New" w:cs="Courier New"/>
-        </w:rPr>
-        <w:t>\</w:t>
+        <w:t>.\</w:t>
       </w:r>
       <w:proofErr w:type="spellStart"/>
       <w:r>
@@ -884,14 +853,12 @@
         </w:rPr>
         <w:t xml:space="preserve">Type </w:t>
       </w:r>
-      <w:proofErr w:type="gramStart"/>
       <w:r>
         <w:rPr>
           <w:rFonts w:ascii="Courier New" w:hAnsi="Courier New" w:cs="Courier New"/>
         </w:rPr>
         <w:t>deactivate</w:t>
       </w:r>
-      <w:proofErr w:type="gramEnd"/>
       <w:r>
         <w:rPr>
           <w:rFonts w:ascii="Arial" w:hAnsi="Arial" w:cs="Arial"/>
@@ -990,7 +957,6 @@
           <w:rFonts w:ascii="Arial" w:hAnsi="Arial" w:cs="Arial"/>
         </w:rPr>
       </w:pPr>
-      <w:proofErr w:type="gramStart"/>
       <w:r>
         <w:rPr>
           <w:rFonts w:ascii="Arial" w:hAnsi="Arial" w:cs="Arial"/>
@@ -1001,14 +967,7 @@
         <w:rPr>
           <w:rFonts w:ascii="Courier New" w:hAnsi="Courier New" w:cs="Courier New"/>
         </w:rPr>
-        <w:t>.</w:t>
-      </w:r>
-      <w:proofErr w:type="gramEnd"/>
-      <w:r>
-        <w:rPr>
-          <w:rFonts w:ascii="Courier New" w:hAnsi="Courier New" w:cs="Courier New"/>
-        </w:rPr>
-        <w:t>\</w:t>
+        <w:t>.\</w:t>
       </w:r>
       <w:proofErr w:type="spellStart"/>
       <w:r>
@@ -1135,19 +1094,11 @@
         </w:rPr>
         <w:t xml:space="preserve">Then either run the analysis on the next file, or type </w:t>
       </w:r>
-      <w:proofErr w:type="gramStart"/>
-      <w:r>
-        <w:rPr>
-          <w:rFonts w:ascii="Courier New" w:hAnsi="Courier New" w:cs="Courier New"/>
-        </w:rPr>
-        <w:t>deactivate</w:t>
-      </w:r>
-      <w:proofErr w:type="gramEnd"/>
-      <w:r>
-        <w:rPr>
-          <w:rFonts w:ascii="Courier New" w:hAnsi="Courier New" w:cs="Courier New"/>
-        </w:rPr>
-        <w:t xml:space="preserve"> </w:t>
+      <w:r>
+        <w:rPr>
+          <w:rFonts w:ascii="Courier New" w:hAnsi="Courier New" w:cs="Courier New"/>
+        </w:rPr>
+        <w:t xml:space="preserve">deactivate </w:t>
       </w:r>
       <w:r>
         <w:rPr>
@@ -1230,7 +1181,6 @@
           <w:rFonts w:ascii="Arial" w:hAnsi="Arial" w:cs="Arial"/>
         </w:rPr>
       </w:pPr>
-      <w:proofErr w:type="gramStart"/>
       <w:r>
         <w:rPr>
           <w:rFonts w:ascii="Arial" w:hAnsi="Arial" w:cs="Arial"/>
@@ -1241,14 +1191,7 @@
         <w:rPr>
           <w:rFonts w:ascii="Courier New" w:hAnsi="Courier New" w:cs="Courier New"/>
         </w:rPr>
-        <w:t>.</w:t>
-      </w:r>
-      <w:proofErr w:type="gramEnd"/>
-      <w:r>
-        <w:rPr>
-          <w:rFonts w:ascii="Courier New" w:hAnsi="Courier New" w:cs="Courier New"/>
-        </w:rPr>
-        <w:t>\</w:t>
+        <w:t>.\</w:t>
       </w:r>
       <w:proofErr w:type="spellStart"/>
       <w:r>
@@ -1306,13 +1249,7 @@
         <w:rPr>
           <w:rFonts w:ascii="Courier New" w:hAnsi="Courier New" w:cs="Courier New"/>
         </w:rPr>
-        <w:t>display_final_fig</w:t>
-      </w:r>
-      <w:r>
-        <w:rPr>
-          <w:rFonts w:ascii="Courier New" w:hAnsi="Courier New" w:cs="Courier New"/>
-        </w:rPr>
-        <w:t>.py</w:t>
+        <w:t>display_final_fig.py</w:t>
       </w:r>
       <w:r>
         <w:rPr>
@@ -1324,21 +1261,7 @@
         <w:rPr>
           <w:rFonts w:ascii="Arial" w:hAnsi="Arial" w:cs="Arial"/>
         </w:rPr>
-        <w:t xml:space="preserve">display the </w:t>
-      </w:r>
-      <w:proofErr w:type="gramStart"/>
-      <w:r>
-        <w:rPr>
-          <w:rFonts w:ascii="Arial" w:hAnsi="Arial" w:cs="Arial"/>
-        </w:rPr>
-        <w:t>final results</w:t>
-      </w:r>
-      <w:proofErr w:type="gramEnd"/>
-      <w:r>
-        <w:rPr>
-          <w:rFonts w:ascii="Arial" w:hAnsi="Arial" w:cs="Arial"/>
-        </w:rPr>
-        <w:t xml:space="preserve"> in an interactive plot. </w:t>
+        <w:t xml:space="preserve">display the final results in an interactive plot. </w:t>
       </w:r>
       <w:r>
         <w:rPr>
@@ -1378,21 +1301,7 @@
         <w:rPr>
           <w:rFonts w:ascii="Arial" w:hAnsi="Arial" w:cs="Arial"/>
         </w:rPr>
-        <w:t xml:space="preserve">Press </w:t>
-      </w:r>
-      <w:proofErr w:type="gramStart"/>
-      <w:r>
-        <w:rPr>
-          <w:rFonts w:ascii="Arial" w:hAnsi="Arial" w:cs="Arial"/>
-        </w:rPr>
-        <w:t>enter</w:t>
-      </w:r>
-      <w:proofErr w:type="gramEnd"/>
-      <w:r>
-        <w:rPr>
-          <w:rFonts w:ascii="Arial" w:hAnsi="Arial" w:cs="Arial"/>
-        </w:rPr>
-        <w:t xml:space="preserve"> to close the figure when you are finished. </w:t>
+        <w:t xml:space="preserve">Press enter to close the figure when you are finished. </w:t>
       </w:r>
     </w:p>
     <w:p>
@@ -1431,7 +1340,7 @@
 </file>
 
 <file path=word/numbering.xml><?xml version="1.0" encoding="utf-8"?>
-<w:numbering xmlns:wpc="http://schemas.microsoft.com/office/word/2010/wordprocessingCanvas" xmlns:cx="http://schemas.microsoft.com/office/drawing/2014/chartex" xmlns:cx1="http://schemas.microsoft.com/office/drawing/2015/9/8/chartex" xmlns:cx2="http://schemas.microsoft.com/office/drawing/2015/10/21/chartex" xmlns:cx3="http://schemas.microsoft.com/office/drawing/2016/5/9/chartex" xmlns:cx4="http://schemas.microsoft.com/office/drawing/2016/5/10/chartex" xmlns:cx5="http://schemas.microsoft.com/office/drawing/2016/5/11/chartex" xmlns:cx6="http://schemas.microsoft.com/office/drawing/2016/5/12/chartex" xmlns:cx7="http://schemas.microsoft.com/office/drawing/2016/5/13/chartex" xmlns:cx8="http://schemas.microsoft.com/office/drawing/2016/5/14/chartex" xmlns:mc="http://schemas.openxmlformats.org/markup-compatibility/2006" xmlns:aink="http://schemas.microsoft.com/office/drawing/2016/ink" xmlns:am3d="http://schemas.microsoft.com/office/drawing/2017/model3d" xmlns:o="urn:schemas-microsoft-com:office:office" xmlns:oel="http://schemas.microsoft.com/office/2019/extlst" xmlns:r="http://schemas.openxmlformats.org/officeDocument/2006/relationships" xmlns:m="http://schemas.openxmlformats.org/officeDocument/2006/math" xmlns:v="urn:schemas-microsoft-com:vml" xmlns:wp14="http://schemas.microsoft.com/office/word/2010/wordprocessingDrawing" xmlns:wp="http://schemas.openxmlformats.org/drawingml/2006/wordprocessingDrawing" xmlns:w10="urn:schemas-microsoft-com:office:word" xmlns:w="http://schemas.openxmlformats.org/wordprocessingml/2006/main" xmlns:w14="http://schemas.microsoft.com/office/word/2010/wordml" xmlns:w15="http://schemas.microsoft.com/office/word/2012/wordml" xmlns:w16cex="http://schemas.microsoft.com/office/word/2018/wordml/cex" xmlns:w16cid="http://schemas.microsoft.com/office/word/2016/wordml/cid" xmlns:w16="http://schemas.microsoft.com/office/word/2018/wordml" xmlns:w16sdtdh="http://schemas.microsoft.com/office/word/2020/wordml/sdtdatahash" xmlns:w16se="http://schemas.microsoft.com/office/word/2015/wordml/symex" xmlns:wpg="http://schemas.microsoft.com/office/word/2010/wordprocessingGroup" xmlns:wpi="http://schemas.microsoft.com/office/word/2010/wordprocessingInk" xmlns:wne="http://schemas.microsoft.com/office/word/2006/wordml" xmlns:wps="http://schemas.microsoft.com/office/word/2010/wordprocessingShape" mc:Ignorable="w14 w15 w16se w16cid w16 w16cex w16sdtdh wp14">
+<w:numbering xmlns:wpc="http://schemas.microsoft.com/office/word/2010/wordprocessingCanvas" xmlns:cx="http://schemas.microsoft.com/office/drawing/2014/chartex" xmlns:cx1="http://schemas.microsoft.com/office/drawing/2015/9/8/chartex" xmlns:cx2="http://schemas.microsoft.com/office/drawing/2015/10/21/chartex" xmlns:cx3="http://schemas.microsoft.com/office/drawing/2016/5/9/chartex" xmlns:cx4="http://schemas.microsoft.com/office/drawing/2016/5/10/chartex" xmlns:cx5="http://schemas.microsoft.com/office/drawing/2016/5/11/chartex" xmlns:cx6="http://schemas.microsoft.com/office/drawing/2016/5/12/chartex" xmlns:cx7="http://schemas.microsoft.com/office/drawing/2016/5/13/chartex" xmlns:cx8="http://schemas.microsoft.com/office/drawing/2016/5/14/chartex" xmlns:mc="http://schemas.openxmlformats.org/markup-compatibility/2006" xmlns:aink="http://schemas.microsoft.com/office/drawing/2016/ink" xmlns:am3d="http://schemas.microsoft.com/office/drawing/2017/model3d" xmlns:o="urn:schemas-microsoft-com:office:office" xmlns:oel="http://schemas.microsoft.com/office/2019/extlst" xmlns:r="http://schemas.openxmlformats.org/officeDocument/2006/relationships" xmlns:m="http://schemas.openxmlformats.org/officeDocument/2006/math" xmlns:v="urn:schemas-microsoft-com:vml" xmlns:wp14="http://schemas.microsoft.com/office/word/2010/wordprocessingDrawing" xmlns:wp="http://schemas.openxmlformats.org/drawingml/2006/wordprocessingDrawing" xmlns:w10="urn:schemas-microsoft-com:office:word" xmlns:w="http://schemas.openxmlformats.org/wordprocessingml/2006/main" xmlns:w14="http://schemas.microsoft.com/office/word/2010/wordml" xmlns:w15="http://schemas.microsoft.com/office/word/2012/wordml" xmlns:w16cex="http://schemas.microsoft.com/office/word/2018/wordml/cex" xmlns:w16cid="http://schemas.microsoft.com/office/word/2016/wordml/cid" xmlns:w16="http://schemas.microsoft.com/office/word/2018/wordml" xmlns:w16du="http://schemas.microsoft.com/office/word/2023/wordml/word16du" xmlns:w16sdtdh="http://schemas.microsoft.com/office/word/2020/wordml/sdtdatahash" xmlns:w16se="http://schemas.microsoft.com/office/word/2015/wordml/symex" xmlns:wpg="http://schemas.microsoft.com/office/word/2010/wordprocessingGroup" xmlns:wpi="http://schemas.microsoft.com/office/word/2010/wordprocessingInk" xmlns:wne="http://schemas.microsoft.com/office/word/2006/wordml" xmlns:wps="http://schemas.microsoft.com/office/word/2010/wordprocessingShape" mc:Ignorable="w14 w15 w16se w16cid w16 w16cex w16sdtdh w16du wp14">
   <w:abstractNum w:abstractNumId="0" w15:restartNumberingAfterBreak="0">
     <w:nsid w:val="57C742D3"/>
     <w:multiLevelType w:val="hybridMultilevel"/>
@@ -1712,7 +1621,7 @@
 </file>
 
 <file path=word/styles.xml><?xml version="1.0" encoding="utf-8"?>
-<w:styles xmlns:mc="http://schemas.openxmlformats.org/markup-compatibility/2006" xmlns:r="http://schemas.openxmlformats.org/officeDocument/2006/relationships" xmlns:w="http://schemas.openxmlformats.org/wordprocessingml/2006/main" xmlns:w14="http://schemas.microsoft.com/office/word/2010/wordml" xmlns:w15="http://schemas.microsoft.com/office/word/2012/wordml" xmlns:w16cex="http://schemas.microsoft.com/office/word/2018/wordml/cex" xmlns:w16cid="http://schemas.microsoft.com/office/word/2016/wordml/cid" xmlns:w16="http://schemas.microsoft.com/office/word/2018/wordml" xmlns:w16sdtdh="http://schemas.microsoft.com/office/word/2020/wordml/sdtdatahash" xmlns:w16se="http://schemas.microsoft.com/office/word/2015/wordml/symex" mc:Ignorable="w14 w15 w16se w16cid w16 w16cex w16sdtdh">
+<w:styles xmlns:mc="http://schemas.openxmlformats.org/markup-compatibility/2006" xmlns:r="http://schemas.openxmlformats.org/officeDocument/2006/relationships" xmlns:w="http://schemas.openxmlformats.org/wordprocessingml/2006/main" xmlns:w14="http://schemas.microsoft.com/office/word/2010/wordml" xmlns:w15="http://schemas.microsoft.com/office/word/2012/wordml" xmlns:w16cex="http://schemas.microsoft.com/office/word/2018/wordml/cex" xmlns:w16cid="http://schemas.microsoft.com/office/word/2016/wordml/cid" xmlns:w16="http://schemas.microsoft.com/office/word/2018/wordml" xmlns:w16du="http://schemas.microsoft.com/office/word/2023/wordml/word16du" xmlns:w16sdtdh="http://schemas.microsoft.com/office/word/2020/wordml/sdtdatahash" xmlns:w16se="http://schemas.microsoft.com/office/word/2015/wordml/symex" mc:Ignorable="w14 w15 w16se w16cid w16 w16cex w16sdtdh w16du">
   <w:docDefaults>
     <w:rPrDefault>
       <w:rPr>

</xml_diff>